<commit_message>
Changed board creation system
</commit_message>
<xml_diff>
--- a/Docs/Playtests.docx
+++ b/Docs/Playtests.docx
@@ -16,6 +16,47 @@
     <w:p>
       <w:pPr>
         <w:pBdr>
+          <w:bottom w:val="single" w:sz="6" w:space="1" w:color="auto"/>
+        </w:pBdr>
+        <w:rPr>
+          <w:rFonts w:ascii="Times New Roman" w:hAnsi="Times New Roman" w:cs="Times New Roman"/>
+          <w:sz w:val="32"/>
+        </w:rPr>
+      </w:pPr>
+      <w:r>
+        <w:rPr>
+          <w:rFonts w:ascii="Times New Roman" w:hAnsi="Times New Roman" w:cs="Times New Roman"/>
+          <w:sz w:val="32"/>
+        </w:rPr>
+        <w:t xml:space="preserve">Emi </w:t>
+      </w:r>
+      <w:proofErr w:type="spellStart"/>
+      <w:r>
+        <w:rPr>
+          <w:rFonts w:ascii="Times New Roman" w:hAnsi="Times New Roman" w:cs="Times New Roman"/>
+          <w:sz w:val="32"/>
+        </w:rPr>
+        <w:t>vs</w:t>
+      </w:r>
+      <w:proofErr w:type="spellEnd"/>
+      <w:r>
+        <w:rPr>
+          <w:rFonts w:ascii="Times New Roman" w:hAnsi="Times New Roman" w:cs="Times New Roman"/>
+          <w:sz w:val="32"/>
+        </w:rPr>
+        <w:t xml:space="preserve"> normal army (Items: Blood stew, hex, oil, ice), Player: 4</w:t>
+      </w:r>
+      <w:r>
+        <w:rPr>
+          <w:rFonts w:ascii="Times New Roman" w:hAnsi="Times New Roman" w:cs="Times New Roman"/>
+          <w:sz w:val="32"/>
+        </w:rPr>
+        <w:t xml:space="preserve"> units, Enemy: 5 units, bigger map</w:t>
+      </w:r>
+    </w:p>
+    <w:p>
+      <w:pPr>
+        <w:pBdr>
           <w:bottom w:val="single" w:sz="12" w:space="1" w:color="auto"/>
         </w:pBdr>
         <w:rPr>
@@ -23,38 +64,61 @@
           <w:sz w:val="32"/>
         </w:rPr>
       </w:pPr>
-    </w:p>
-    <w:p>
-      <w:pPr>
-        <w:pBdr>
-          <w:bottom w:val="single" w:sz="6" w:space="1" w:color="auto"/>
-        </w:pBdr>
-        <w:rPr>
-          <w:rFonts w:ascii="Times New Roman" w:hAnsi="Times New Roman" w:cs="Times New Roman"/>
-          <w:sz w:val="32"/>
-        </w:rPr>
-      </w:pPr>
-      <w:r>
-        <w:rPr>
-          <w:rFonts w:ascii="Times New Roman" w:hAnsi="Times New Roman" w:cs="Times New Roman"/>
-          <w:sz w:val="32"/>
-        </w:rPr>
-        <w:t>Emi</w:t>
-      </w:r>
-      <w:r>
-        <w:rPr>
-          <w:rFonts w:ascii="Times New Roman" w:hAnsi="Times New Roman" w:cs="Times New Roman"/>
-          <w:sz w:val="32"/>
-        </w:rPr>
-        <w:t xml:space="preserve"> </w:t>
-      </w:r>
+      <w:r>
+        <w:rPr>
+          <w:rFonts w:ascii="Times New Roman" w:hAnsi="Times New Roman" w:cs="Times New Roman"/>
+          <w:sz w:val="32"/>
+        </w:rPr>
+        <w:t xml:space="preserve">3 cell </w:t>
+      </w:r>
+      <w:proofErr w:type="gramStart"/>
+      <w:r>
+        <w:rPr>
+          <w:rFonts w:ascii="Times New Roman" w:hAnsi="Times New Roman" w:cs="Times New Roman"/>
+          <w:sz w:val="32"/>
+        </w:rPr>
+        <w:t>distance</w:t>
+      </w:r>
+      <w:proofErr w:type="gramEnd"/>
+      <w:r>
+        <w:rPr>
+          <w:rFonts w:ascii="Times New Roman" w:hAnsi="Times New Roman" w:cs="Times New Roman"/>
+          <w:sz w:val="32"/>
+        </w:rPr>
+        <w:t xml:space="preserve"> between objectives and units feels like too </w:t>
+      </w:r>
+      <w:r>
+        <w:rPr>
+          <w:rFonts w:ascii="Times New Roman" w:hAnsi="Times New Roman" w:cs="Times New Roman"/>
+          <w:sz w:val="32"/>
+        </w:rPr>
+        <w:t>long to travel through</w:t>
+      </w:r>
+      <w:r>
+        <w:rPr>
+          <w:rFonts w:ascii="Times New Roman" w:hAnsi="Times New Roman" w:cs="Times New Roman"/>
+          <w:sz w:val="32"/>
+        </w:rPr>
+        <w:t xml:space="preserve"> when testing, should try in a real game where the movement is faster</w:t>
+      </w:r>
+    </w:p>
+    <w:p>
+      <w:pPr>
+        <w:pBdr>
+          <w:bottom w:val="single" w:sz="12" w:space="1" w:color="auto"/>
+        </w:pBdr>
+        <w:rPr>
+          <w:rFonts w:ascii="Times New Roman" w:hAnsi="Times New Roman" w:cs="Times New Roman"/>
+          <w:sz w:val="32"/>
+        </w:rPr>
+      </w:pPr>
       <w:proofErr w:type="spellStart"/>
       <w:r>
         <w:rPr>
           <w:rFonts w:ascii="Times New Roman" w:hAnsi="Times New Roman" w:cs="Times New Roman"/>
           <w:sz w:val="32"/>
         </w:rPr>
-        <w:t>vs</w:t>
+        <w:t>Transweb</w:t>
       </w:r>
       <w:proofErr w:type="spellEnd"/>
       <w:r>
@@ -62,35 +126,23 @@
           <w:rFonts w:ascii="Times New Roman" w:hAnsi="Times New Roman" w:cs="Times New Roman"/>
           <w:sz w:val="32"/>
         </w:rPr>
-        <w:t xml:space="preserve"> </w:t>
-      </w:r>
-      <w:r>
-        <w:rPr>
-          <w:rFonts w:ascii="Times New Roman" w:hAnsi="Times New Roman" w:cs="Times New Roman"/>
-          <w:sz w:val="32"/>
-        </w:rPr>
-        <w:t>cheap heavy army</w:t>
-      </w:r>
-      <w:r>
-        <w:rPr>
-          <w:rFonts w:ascii="Times New Roman" w:hAnsi="Times New Roman" w:cs="Times New Roman"/>
-          <w:sz w:val="32"/>
-        </w:rPr>
-        <w:t xml:space="preserve"> (Items: Bowls, hex, water, oil), Player: </w:t>
-      </w:r>
-      <w:r>
-        <w:rPr>
-          <w:rFonts w:ascii="Times New Roman" w:hAnsi="Times New Roman" w:cs="Times New Roman"/>
-          <w:sz w:val="32"/>
-        </w:rPr>
-        <w:t>4</w:t>
-      </w:r>
-      <w:r>
-        <w:rPr>
-          <w:rFonts w:ascii="Times New Roman" w:hAnsi="Times New Roman" w:cs="Times New Roman"/>
-          <w:sz w:val="32"/>
-        </w:rPr>
-        <w:t xml:space="preserve"> units, Enemy: 5 units </w:t>
+        <w:t xml:space="preserve"> construct is </w:t>
+      </w:r>
+      <w:proofErr w:type="spellStart"/>
+      <w:r>
+        <w:rPr>
+          <w:rFonts w:ascii="Times New Roman" w:hAnsi="Times New Roman" w:cs="Times New Roman"/>
+          <w:sz w:val="32"/>
+        </w:rPr>
+        <w:t>kinda</w:t>
+      </w:r>
+      <w:proofErr w:type="spellEnd"/>
+      <w:r>
+        <w:rPr>
+          <w:rFonts w:ascii="Times New Roman" w:hAnsi="Times New Roman" w:cs="Times New Roman"/>
+          <w:sz w:val="32"/>
+        </w:rPr>
+        <w:t xml:space="preserve"> useless and will be probably hard to implement for Emi, Should change</w:t>
       </w:r>
     </w:p>
     <w:p>
@@ -108,21 +160,14 @@
           <w:rFonts w:ascii="Times New Roman" w:hAnsi="Times New Roman" w:cs="Times New Roman"/>
           <w:sz w:val="32"/>
         </w:rPr>
-        <w:t xml:space="preserve">“Cheap” mechanic seems interesting, gives player real incentive to go for cheap units instead of </w:t>
-      </w:r>
-      <w:r>
-        <w:rPr>
-          <w:rFonts w:ascii="Times New Roman" w:hAnsi="Times New Roman" w:cs="Times New Roman"/>
-          <w:sz w:val="32"/>
-        </w:rPr>
-        <w:t>powerful ones</w:t>
-      </w:r>
-      <w:r>
-        <w:rPr>
-          <w:rFonts w:ascii="Times New Roman" w:hAnsi="Times New Roman" w:cs="Times New Roman"/>
-          <w:sz w:val="32"/>
-        </w:rPr>
-        <w:t xml:space="preserve"> </w:t>
+        <w:t>Blood</w:t>
+      </w:r>
+      <w:r>
+        <w:rPr>
+          <w:rFonts w:ascii="Times New Roman" w:hAnsi="Times New Roman" w:cs="Times New Roman"/>
+          <w:sz w:val="32"/>
+        </w:rPr>
+        <w:t xml:space="preserve"> stew seems strong but balanced enough</w:t>
       </w:r>
     </w:p>
     <w:p>
@@ -140,7 +185,7 @@
           <w:rFonts w:ascii="Times New Roman" w:hAnsi="Times New Roman" w:cs="Times New Roman"/>
           <w:sz w:val="32"/>
         </w:rPr>
-        <w:t>Emi seems like a less powerful enemy, fast moving units are not great at big quantities</w:t>
+        <w:t>Ice bucket is good</w:t>
       </w:r>
     </w:p>
     <w:p>
@@ -153,6 +198,49 @@
           <w:sz w:val="32"/>
         </w:rPr>
       </w:pPr>
+      <w:r>
+        <w:rPr>
+          <w:rFonts w:ascii="Times New Roman" w:hAnsi="Times New Roman" w:cs="Times New Roman"/>
+          <w:sz w:val="32"/>
+        </w:rPr>
+        <w:t>Hex is okay enough</w:t>
+      </w:r>
+    </w:p>
+    <w:p>
+      <w:pPr>
+        <w:pBdr>
+          <w:bottom w:val="single" w:sz="12" w:space="1" w:color="auto"/>
+        </w:pBdr>
+        <w:rPr>
+          <w:rFonts w:ascii="Times New Roman" w:hAnsi="Times New Roman" w:cs="Times New Roman"/>
+          <w:sz w:val="32"/>
+        </w:rPr>
+      </w:pPr>
+      <w:r>
+        <w:rPr>
+          <w:rFonts w:ascii="Times New Roman" w:hAnsi="Times New Roman" w:cs="Times New Roman"/>
+          <w:sz w:val="32"/>
+        </w:rPr>
+        <w:t>Siren is very bad for positioning since she can barely move</w:t>
+      </w:r>
+    </w:p>
+    <w:p>
+      <w:pPr>
+        <w:pBdr>
+          <w:bottom w:val="single" w:sz="12" w:space="1" w:color="auto"/>
+        </w:pBdr>
+        <w:rPr>
+          <w:rFonts w:ascii="Times New Roman" w:hAnsi="Times New Roman" w:cs="Times New Roman"/>
+          <w:sz w:val="32"/>
+        </w:rPr>
+      </w:pPr>
+      <w:r>
+        <w:rPr>
+          <w:rFonts w:ascii="Times New Roman" w:hAnsi="Times New Roman" w:cs="Times New Roman"/>
+          <w:sz w:val="32"/>
+        </w:rPr>
+        <w:t>Conductor doesn’t work well with other units since combos isn’t really Emi’s thing, should change for someone else</w:t>
+      </w:r>
       <w:bookmarkStart w:id="0" w:name="_GoBack"/>
       <w:bookmarkEnd w:id="0"/>
     </w:p>
@@ -171,6 +259,115 @@
           <w:rFonts w:ascii="Times New Roman" w:hAnsi="Times New Roman" w:cs="Times New Roman"/>
           <w:sz w:val="32"/>
         </w:rPr>
+        <w:t xml:space="preserve">Emi </w:t>
+      </w:r>
+      <w:proofErr w:type="spellStart"/>
+      <w:r>
+        <w:rPr>
+          <w:rFonts w:ascii="Times New Roman" w:hAnsi="Times New Roman" w:cs="Times New Roman"/>
+          <w:sz w:val="32"/>
+        </w:rPr>
+        <w:t>vs</w:t>
+      </w:r>
+      <w:proofErr w:type="spellEnd"/>
+      <w:r>
+        <w:rPr>
+          <w:rFonts w:ascii="Times New Roman" w:hAnsi="Times New Roman" w:cs="Times New Roman"/>
+          <w:sz w:val="32"/>
+        </w:rPr>
+        <w:t xml:space="preserve"> cheap heavy army (Items: Bowls, hex, water, oil), Player: </w:t>
+      </w:r>
+      <w:r>
+        <w:rPr>
+          <w:rFonts w:ascii="Times New Roman" w:hAnsi="Times New Roman" w:cs="Times New Roman"/>
+          <w:sz w:val="32"/>
+        </w:rPr>
+        <w:t>4</w:t>
+      </w:r>
+      <w:r>
+        <w:rPr>
+          <w:rFonts w:ascii="Times New Roman" w:hAnsi="Times New Roman" w:cs="Times New Roman"/>
+          <w:sz w:val="32"/>
+        </w:rPr>
+        <w:t xml:space="preserve"> units, Enemy: 5 units </w:t>
+      </w:r>
+    </w:p>
+    <w:p>
+      <w:pPr>
+        <w:pBdr>
+          <w:bottom w:val="single" w:sz="12" w:space="1" w:color="auto"/>
+        </w:pBdr>
+        <w:rPr>
+          <w:rFonts w:ascii="Times New Roman" w:hAnsi="Times New Roman" w:cs="Times New Roman"/>
+          <w:sz w:val="32"/>
+        </w:rPr>
+      </w:pPr>
+      <w:r>
+        <w:rPr>
+          <w:rFonts w:ascii="Times New Roman" w:hAnsi="Times New Roman" w:cs="Times New Roman"/>
+          <w:sz w:val="32"/>
+        </w:rPr>
+        <w:t xml:space="preserve">“Cheap” mechanic seems interesting, gives player real incentive to go for cheap units instead of </w:t>
+      </w:r>
+      <w:r>
+        <w:rPr>
+          <w:rFonts w:ascii="Times New Roman" w:hAnsi="Times New Roman" w:cs="Times New Roman"/>
+          <w:sz w:val="32"/>
+        </w:rPr>
+        <w:t>powerful ones</w:t>
+      </w:r>
+      <w:r>
+        <w:rPr>
+          <w:rFonts w:ascii="Times New Roman" w:hAnsi="Times New Roman" w:cs="Times New Roman"/>
+          <w:sz w:val="32"/>
+        </w:rPr>
+        <w:t xml:space="preserve"> </w:t>
+      </w:r>
+    </w:p>
+    <w:p>
+      <w:pPr>
+        <w:pBdr>
+          <w:bottom w:val="single" w:sz="12" w:space="1" w:color="auto"/>
+        </w:pBdr>
+        <w:rPr>
+          <w:rFonts w:ascii="Times New Roman" w:hAnsi="Times New Roman" w:cs="Times New Roman"/>
+          <w:sz w:val="32"/>
+        </w:rPr>
+      </w:pPr>
+      <w:r>
+        <w:rPr>
+          <w:rFonts w:ascii="Times New Roman" w:hAnsi="Times New Roman" w:cs="Times New Roman"/>
+          <w:sz w:val="32"/>
+        </w:rPr>
+        <w:t>Emi seems like a less powerful enemy, fast moving units are not great at big quantities</w:t>
+      </w:r>
+    </w:p>
+    <w:p>
+      <w:pPr>
+        <w:pBdr>
+          <w:bottom w:val="single" w:sz="12" w:space="1" w:color="auto"/>
+        </w:pBdr>
+        <w:rPr>
+          <w:rFonts w:ascii="Times New Roman" w:hAnsi="Times New Roman" w:cs="Times New Roman"/>
+          <w:sz w:val="32"/>
+        </w:rPr>
+      </w:pPr>
+    </w:p>
+    <w:p>
+      <w:pPr>
+        <w:pBdr>
+          <w:bottom w:val="single" w:sz="6" w:space="1" w:color="auto"/>
+        </w:pBdr>
+        <w:rPr>
+          <w:rFonts w:ascii="Times New Roman" w:hAnsi="Times New Roman" w:cs="Times New Roman"/>
+          <w:sz w:val="32"/>
+        </w:rPr>
+      </w:pPr>
+      <w:r>
+        <w:rPr>
+          <w:rFonts w:ascii="Times New Roman" w:hAnsi="Times New Roman" w:cs="Times New Roman"/>
+          <w:sz w:val="32"/>
+        </w:rPr>
         <w:t xml:space="preserve">New Toddy </w:t>
       </w:r>
       <w:proofErr w:type="spellStart"/>
@@ -252,6 +449,7 @@
           <w:rFonts w:ascii="Times New Roman" w:hAnsi="Times New Roman" w:cs="Times New Roman"/>
           <w:sz w:val="32"/>
         </w:rPr>
+        <w:lastRenderedPageBreak/>
         <w:t xml:space="preserve">Blocking objectives from the start doesn’t really impact </w:t>
       </w:r>
       <w:r>

</xml_diff>